<commit_message>
update chapter IV draft in thesis documentation
</commit_message>
<xml_diff>
--- a/thesis_docs/Gleich-700B-ChpIV.docx
+++ b/thesis_docs/Gleich-700B-ChpIV.docx
@@ -127,7 +127,25 @@
         <w:t xml:space="preserve">these results (see Figure 4.1), </w:t>
       </w:r>
       <w:r>
-        <w:t>this chapter is organized into four sections: Section 4.1 presents the initial exploratory data analysis across the longitudinal multi-source warehouse; Section 4.2 details the four-tier filtering pipeline that established the nine-airport, twelve-complex experimental cohort; Section 4.3 outlines feature engineering, training configurations, and 2025 holdout execution protocols; and Section 4.4 reports the comparative model evaluations across robustness, resilience, and generalizability.</w:t>
+        <w:t>this chapter is organized into four sections: Section 4.1 presents the initial exploratory data analysis across the multi-source</w:t>
+      </w:r>
+      <w:r>
+        <w:t xml:space="preserve"> data</w:t>
+      </w:r>
+      <w:r>
+        <w:t xml:space="preserve"> warehouse; Section 4.2 details the four-tier filtering pipeline that establishe</w:t>
+      </w:r>
+      <w:r>
+        <w:t>s</w:t>
+      </w:r>
+      <w:r>
+        <w:t xml:space="preserve"> the nine-airport, twelve-complex experimental cohort; Section 4.3 outlines feature engineering, training configurations, and 2025 holdout execution protocols; and Section 4.4 </w:t>
+      </w:r>
+      <w:r>
+        <w:t>discusses</w:t>
+      </w:r>
+      <w:r>
+        <w:t xml:space="preserve"> the comparative model evaluations across robustness, resilience, and generalizability.</w:t>
       </w:r>
       <w:r>
         <w:rPr>
@@ -162,7 +180,7 @@
                     <pic:cNvPicPr/>
                   </pic:nvPicPr>
                   <pic:blipFill>
-                    <a:blip r:embed="rId5"/>
+                    <a:blip r:embed="rId6"/>
                     <a:stretch>
                       <a:fillRect/>
                     </a:stretch>
@@ -2521,10 +2539,19 @@
         <w:t xml:space="preserve">from January 1, 2019 to December 31, 2025. The initial upstream repository captured 67.22 million raw </w:t>
       </w:r>
       <w:r>
-        <w:t>operational transaction records. a</w:t>
-      </w:r>
-      <w:r>
-        <w:t>cross TSA checkpoint logs, Bureau of Transportation Statistics (BTS) On-Time Performance (OTP), BTS Form 41 Schedule T-100 Segment data, and BTS DB1B/DB1C ticket coupon surveys (Appendix for details).</w:t>
+        <w:t>operational transaction records a</w:t>
+      </w:r>
+      <w:r>
+        <w:t xml:space="preserve">cross TSA checkpoint logs, Bureau of Transportation Statistics (BTS) On-Time Performance (OTP), BTS Form 41 Schedule T-100 Segment data, and BTS DB1B/DB1C ticket coupon surveys </w:t>
+      </w:r>
+      <w:r>
+        <w:rPr>
+          <w:highlight w:val="yellow"/>
+        </w:rPr>
+        <w:t>(Appendix for details)</w:t>
+      </w:r>
+      <w:r>
+        <w:t>.</w:t>
       </w:r>
     </w:p>
     <w:p>
@@ -2536,7 +2563,20 @@
         <w:t xml:space="preserve">Following conformed extraction, automated entity resolution, data cleaning, and </w:t>
       </w:r>
       <w:r>
-        <w:t xml:space="preserve">relational synthesis across standardized operational dimensions (calendar date, departure time block, airfield, operating carrier, fleet aircraft type, and dedicated screening complex), </w:t>
+        <w:t xml:space="preserve">relational synthesis across standardized operational dimensions </w:t>
+      </w:r>
+      <w:commentRangeStart w:id="6"/>
+      <w:r>
+        <w:t xml:space="preserve">(calendar date, departure time block, airfield, operating carrier, fleet aircraft type, and dedicated screening complex), </w:t>
+      </w:r>
+      <w:commentRangeEnd w:id="6"/>
+      <w:r>
+        <w:rPr>
+          <w:rStyle w:val="CommentReference"/>
+          <w:sz w:val="24"/>
+          <w:szCs w:val="24"/>
+        </w:rPr>
+        <w:commentReference w:id="6"/>
       </w:r>
       <w:r>
         <w:t>the nationwide post-ETL analytical warehouse retains 42,062,039 conformed records across the candidate network of the Top 25 U.S. commercial airfields. Table 4.1 documents the post-ETL data foundation census across all four federal data sources.</w:t>
@@ -2606,7 +2646,7 @@
                     <pic:cNvPicPr/>
                   </pic:nvPicPr>
                   <pic:blipFill>
-                    <a:blip r:embed="rId6"/>
+                    <a:blip r:embed="rId11"/>
                     <a:stretch>
                       <a:fillRect/>
                     </a:stretch>
@@ -2675,7 +2715,7 @@
                     <pic:cNvPicPr/>
                   </pic:nvPicPr>
                   <pic:blipFill>
-                    <a:blip r:embed="rId7"/>
+                    <a:blip r:embed="rId12"/>
                     <a:stretch>
                       <a:fillRect/>
                     </a:stretch>
@@ -2698,55 +2738,16 @@
     </w:p>
     <w:p>
       <w:pPr>
-        <w:ind w:firstLine="720"/>
         <w:contextualSpacing/>
       </w:pPr>
-      <w:commentRangeStart w:id="6"/>
-      <w:r>
-        <w:t>At the macro network level, the 25 candidate airfields processed an annual mean of 192,160 scheduled commercial domestic departures (</w:t>
-      </w:r>
-      <m:oMath>
-        <m:r>
-          <w:rPr>
-            <w:rFonts w:ascii="Cambria Math" w:hAnsi="Cambria Math"/>
-          </w:rPr>
-          <m:t>σ=69,376</m:t>
-        </m:r>
-      </m:oMath>
-      <w:r>
-        <w:t>; median = 177,182), ranging from 95,849 departures at Washington Dulles (IAD) to 360,571 departures at Chicago O'Hare (ORD). Systemwide passenger screening throughput averaged 68.50 million passengers per airfield annually (</w:t>
-      </w:r>
-      <m:oMath>
-        <m:r>
-          <w:rPr>
-            <w:rFonts w:ascii="Cambria Math" w:hAnsi="Cambria Math"/>
-          </w:rPr>
-          <m:t>σ=27.76</m:t>
-        </m:r>
-        <m:r>
-          <m:rPr>
-            <m:nor/>
-          </m:rPr>
-          <m:t>M</m:t>
-        </m:r>
-      </m:oMath>
-      <w:r>
-        <w:t xml:space="preserve">; median = 66.01M), with Charlotte Douglas (CLT) recording 28.17 million passengers and Los Angeles International (LAX) processing 129.07 million passengers across the multi-year study period. (Refer to appendix for data </w:t>
-      </w:r>
-      <w:r>
-        <w:t>filtering and quality assurance protocols</w:t>
-      </w:r>
-      <w:r>
-        <w:t>).</w:t>
-      </w:r>
-      <w:commentRangeEnd w:id="6"/>
-      <w:r>
-        <w:rPr>
-          <w:rStyle w:val="CommentReference"/>
-          <w:sz w:val="24"/>
-          <w:szCs w:val="24"/>
-        </w:rPr>
-        <w:commentReference w:id="6"/>
+      <w:r>
+        <w:t xml:space="preserve">See </w:t>
+      </w:r>
+      <w:r>
+        <w:t xml:space="preserve">Appendix for a discussion of </w:t>
+      </w:r>
+      <w:r>
+        <w:t>descriptive statistics for post ETL Data</w:t>
       </w:r>
     </w:p>
     <w:p>
@@ -2809,11 +2810,7 @@
         </m:r>
       </m:oMath>
       <w:r>
-        <w:t xml:space="preserve">-tests and Cumulative Sum (CUSUM) trajectory tracking </w:t>
-      </w:r>
-      <w:r>
-        <w:lastRenderedPageBreak/>
-        <w:t>across the Top 25 airfields – confirmed May 1, 2022, as the structural equilibrium demarcation point for predictive model development. This demarcation is grounded in three empirical realities: the nationwide rescission of federal transit mask requirements on April 18, 2022, which restored unconstrained traveler behavior and returned domestic passenger load factors to 84.7%; the stabilization of commercial coupling between scheduled flights and screening demand from an artificial pandemic high (</w:t>
+        <w:t>-tests and Cumulative Sum (CUSUM) trajectory tracking across the Top 25 airfields – confirmed May 1, 2022, as the structural equilibrium demarcation point for predictive model development. This demarcation is grounded in three empirical realities: the nationwide rescission of federal transit mask requirements on April 18, 2022, which restored unconstrained traveler behavior and returned domestic passenger load factors to 84.7%; the stabilization of commercial coupling between scheduled flights and screening demand from an artificial pandemic high (</w:t>
       </w:r>
       <m:oMath>
         <m:r>
@@ -2897,7 +2894,15 @@
         </m:r>
       </m:oMath>
       <w:r>
-        <w:t>); and the establishment of a clean 32-month development baseline. This development window was partitioned into a 20-month training window (May 1, 2022 – December 31, 2023), a 12-month validation window (January 1, 2024 – December 31, 2024), and an untouched 12-month out-of-time holdout test set (January 1, 2025 – December 31, 2025), separated by a 7-day operational purge buffer to prevent multi-day delay cascades from leaking across partition boundaries.</w:t>
+        <w:t xml:space="preserve">); and the establishment of a clean 32-month development </w:t>
+      </w:r>
+      <w:r>
+        <w:lastRenderedPageBreak/>
+        <w:t xml:space="preserve">baseline. </w:t>
+      </w:r>
+      <w:commentRangeStart w:id="11"/>
+      <w:r>
+        <w:t>This development window was partitioned into a 20-month training window (May 1, 2022 – December 31, 2023), a 12-month validation window (January 1, 2024 – December 31, 2024), and an untouched 12-month out-of-time holdout test set (January 1, 2025 – December 31, 2025), separated by a 7-day operational purge buffer to prevent multi-day delay cascades from leaking across partition boundaries.</w:t>
       </w:r>
       <w:r>
         <w:rPr>
@@ -2906,18 +2911,27 @@
         </w:rPr>
         <w:t xml:space="preserve"> </w:t>
       </w:r>
+      <w:commentRangeEnd w:id="11"/>
+      <w:r>
+        <w:rPr>
+          <w:rStyle w:val="CommentReference"/>
+          <w:sz w:val="24"/>
+          <w:szCs w:val="24"/>
+        </w:rPr>
+        <w:commentReference w:id="11"/>
+      </w:r>
     </w:p>
     <w:p>
       <w:pPr>
         <w:pStyle w:val="Heading3"/>
       </w:pPr>
-      <w:bookmarkStart w:id="11" w:name="_Toc242174149"/>
-      <w:bookmarkStart w:id="12" w:name="_Toc242174801"/>
+      <w:bookmarkStart w:id="12" w:name="_Toc242174149"/>
+      <w:bookmarkStart w:id="13" w:name="_Toc242174801"/>
       <w:r>
         <w:t>Defining Seasonality</w:t>
       </w:r>
-      <w:bookmarkEnd w:id="11"/>
       <w:bookmarkEnd w:id="12"/>
+      <w:bookmarkEnd w:id="13"/>
     </w:p>
     <w:p>
       <w:pPr>
@@ -2930,6 +2944,12 @@
       </w:pPr>
       <w:r>
         <w:t>Just as temporal boundaries must be established on the complete Top 25 network, defining seasonality requires capturing the full variance of nationwide commercial aviation. Aviation seasonality operates along three coupled dimensions: annual seasonal volatility regimes, day-of-week demand archetypes, and non-consecutive turbulence peaks.</w:t>
+      </w:r>
+      <w:r>
+        <w:t xml:space="preserve"> See appendix for </w:t>
+      </w:r>
+      <w:r>
+        <w:t xml:space="preserve">Seasonality Dimensions detail. It is important to define these for models to take into account so like for like is being compared. </w:t>
       </w:r>
     </w:p>
     <w:p>
@@ -3100,7 +3120,6 @@
           <w:b/>
           <w:bCs/>
         </w:rPr>
-        <w:lastRenderedPageBreak/>
         <w:t>Table 4.3</w:t>
       </w:r>
       <w:r>
@@ -3122,6 +3141,7 @@
         <w:rPr>
           <w:noProof/>
         </w:rPr>
+        <w:lastRenderedPageBreak/>
         <w:drawing>
           <wp:inline distT="0" distB="0" distL="0" distR="0" wp14:anchorId="45E15C34" wp14:editId="3F3C700C">
             <wp:extent cx="6338018" cy="1176867"/>
@@ -3138,7 +3158,7 @@
                     <pic:cNvPicPr/>
                   </pic:nvPicPr>
                   <pic:blipFill>
-                    <a:blip r:embed="rId12"/>
+                    <a:blip r:embed="rId13"/>
                     <a:stretch>
                       <a:fillRect/>
                     </a:stretch>
@@ -3228,15 +3248,15 @@
         </w:rPr>
         <w:t>Bimodal Intraday Operational Peaks: Morning Surges and Evening Delay Cascades.</w:t>
       </w:r>
-      <w:bookmarkStart w:id="13" w:name="_Toc242174150"/>
-      <w:bookmarkStart w:id="14" w:name="_Toc242174802"/>
+      <w:bookmarkStart w:id="14" w:name="_Toc242174150"/>
+      <w:bookmarkStart w:id="15" w:name="_Toc242174802"/>
     </w:p>
     <w:p>
       <w:pPr>
         <w:ind w:firstLine="720"/>
         <w:contextualSpacing/>
       </w:pPr>
-      <w:commentRangeStart w:id="15"/>
+      <w:commentRangeStart w:id="16"/>
       <w:r>
         <w:t>Rather than dividing each operational day into arbitrary uniform hourly intervals, intraday operations are categorized into three operational regimes capturing the bimodal diurnal congestion structure of commercial airfields. The Off-Peak regime (00:00–03:00, 3–4 hours daily) represents the overnight curfew valley characterized by sparse departures and minimal checkpoint activity. The Mid-Peak regime (08:00 to 13:00/16:00, 4–12 hours daily) reflects a steady midday plateau marked by consistent passenger screening rates and sufficient aircraft turnaround buffers. In contrast, the Peak regime unifies two non-consecutive queuing congestion windows driven by distinct operational mechanisms: the Morning Bank Surge (05:00–08:00), which is governed by extreme passenger arrival variance (</w:t>
       </w:r>
@@ -3312,14 +3332,14 @@
       <w:r>
         <w:t xml:space="preserve"> min) that disrupts scheduled passenger show-up patterns. </w:t>
       </w:r>
-      <w:commentRangeEnd w:id="15"/>
+      <w:commentRangeEnd w:id="16"/>
       <w:r>
         <w:rPr>
           <w:rStyle w:val="CommentReference"/>
           <w:sz w:val="24"/>
           <w:szCs w:val="24"/>
         </w:rPr>
-        <w:commentReference w:id="15"/>
+        <w:commentReference w:id="16"/>
       </w:r>
     </w:p>
     <w:p>
@@ -3339,11 +3359,10 @@
           <w:i/>
           <w:iCs/>
         </w:rPr>
-        <w:lastRenderedPageBreak/>
         <w:t>TSA and OTP Throughput Data</w:t>
       </w:r>
-      <w:bookmarkEnd w:id="13"/>
       <w:bookmarkEnd w:id="14"/>
+      <w:bookmarkEnd w:id="15"/>
     </w:p>
     <w:p>
       <w:pPr>
@@ -3351,6 +3370,7 @@
         <w:contextualSpacing/>
       </w:pPr>
       <w:r>
+        <w:lastRenderedPageBreak/>
         <w:t xml:space="preserve">Evaluating the statistical relationships between TSA checkpoint throughput and Bureau of Transportation Statistics On-Time Performance data across all Top 25 airfields reveals fundamental econometric dynamics. </w:t>
       </w:r>
       <w:r>
@@ -3640,7 +3660,6 @@
           <w:i/>
           <w:iCs/>
         </w:rPr>
-        <w:lastRenderedPageBreak/>
         <w:t>Implications for Subset</w:t>
       </w:r>
     </w:p>
@@ -3650,7 +3669,11 @@
         <w:contextualSpacing/>
       </w:pPr>
       <w:r>
-        <w:t>Establishing temporal boundaries (the May 1, 2022 post-mask demarcation) and seasonal dynamics across the full Top 25 network ensures that baseline operational patterns reflect macroeconomic aviation behavior rather than idiosyncratic facility quirks. To maintain strict methodological integrity and prevent predictive leakage, these macro-level seasonal regimes and cross-dataset relationships are not used as direct regression features. Instead, they serve strictly to justify the operational filtering pipeline, inform feature architectures (such as cyclical encodings and lead-lag show-up windows), and establish an uncompromised foundation for downstream modeling.</w:t>
+        <w:t xml:space="preserve">Establishing temporal boundaries (the May 1, 2022 post-mask demarcation) and seasonal dynamics across the full Top 25 network ensures that baseline operational patterns reflect </w:t>
+      </w:r>
+      <w:r>
+        <w:lastRenderedPageBreak/>
+        <w:t>macroeconomic aviation behavior rather than idiosyncratic facility quirks. To maintain strict methodological integrity and prevent predictive leakage, these macro-level seasonal regimes and cross-dataset relationships are not used as direct regression features. Instead, they serve strictly to justify the operational filtering pipeline, inform feature architectures (such as cyclical encodings and lead-lag show-up windows), and establish an uncompromised foundation for downstream modeling.</w:t>
       </w:r>
       <w:r>
         <w:t xml:space="preserve"> </w:t>
@@ -3800,25 +3823,25 @@
       <w:pPr>
         <w:pStyle w:val="Heading2"/>
       </w:pPr>
-      <w:bookmarkStart w:id="16" w:name="_Toc242174151"/>
-      <w:bookmarkStart w:id="17" w:name="_Toc242174803"/>
+      <w:bookmarkStart w:id="17" w:name="_Toc242174151"/>
+      <w:bookmarkStart w:id="18" w:name="_Toc242174803"/>
       <w:r>
         <w:t>Data Filtering and Subset Selection</w:t>
       </w:r>
-      <w:bookmarkEnd w:id="16"/>
       <w:bookmarkEnd w:id="17"/>
+      <w:bookmarkEnd w:id="18"/>
     </w:p>
     <w:p>
       <w:pPr>
         <w:pStyle w:val="Heading3"/>
       </w:pPr>
-      <w:bookmarkStart w:id="18" w:name="_Toc242174152"/>
-      <w:bookmarkStart w:id="19" w:name="_Toc242174804"/>
+      <w:bookmarkStart w:id="19" w:name="_Toc242174152"/>
+      <w:bookmarkStart w:id="20" w:name="_Toc242174804"/>
       <w:r>
         <w:t>Four-Phase Filtering Pipeline</w:t>
       </w:r>
-      <w:bookmarkEnd w:id="18"/>
       <w:bookmarkEnd w:id="19"/>
+      <w:bookmarkEnd w:id="20"/>
     </w:p>
     <w:p>
       <w:pPr>
@@ -3835,8 +3858,11 @@
         <w:contextualSpacing/>
       </w:pPr>
       <w:r>
+        <w:t xml:space="preserve">The four-phase purposive filtering pipeline systematically isolates single-carrier screening dynamics from confounding network interactions. In Phase 1 (Macro Filter), the national candidate pool of 450+ commercial airfields was filtered down to the Top 25 airfields, enforcing </w:t>
+      </w:r>
+      <w:r>
         <w:lastRenderedPageBreak/>
-        <w:t>The four-phase purposive filtering pipeline systematically isolates single-carrier screening dynamics from confounding network interactions. In Phase 1 (Macro Filter), the national candidate pool of 450+ commercial airfields was filtered down to the Top 25 airfields, enforcing heavy queuing intensity (</w:t>
+        <w:t>heavy queuing intensity (</w:t>
       </w:r>
       <m:oMath>
         <m:sSub>
@@ -4270,7 +4296,6 @@
         <w:rPr>
           <w:noProof/>
         </w:rPr>
-        <w:lastRenderedPageBreak/>
         <w:drawing>
           <wp:inline distT="0" distB="0" distL="0" distR="0" wp14:anchorId="662B189A" wp14:editId="1E5BBA04">
             <wp:extent cx="4546600" cy="1244600"/>
@@ -4287,7 +4312,7 @@
                     <pic:cNvPicPr/>
                   </pic:nvPicPr>
                   <pic:blipFill>
-                    <a:blip r:embed="rId13"/>
+                    <a:blip r:embed="rId14"/>
                     <a:stretch>
                       <a:fillRect/>
                     </a:stretch>
@@ -4318,6 +4343,7 @@
         </w:rPr>
       </w:pPr>
       <w:r>
+        <w:lastRenderedPageBreak/>
         <w:t>To mathematically verify that dedicated checkpoints isolate single-carrier demand, four econometric tests were performed</w:t>
       </w:r>
       <w:r>
@@ -4407,7 +4433,7 @@
                     <pic:cNvPicPr/>
                   </pic:nvPicPr>
                   <pic:blipFill>
-                    <a:blip r:embed="rId14"/>
+                    <a:blip r:embed="rId15"/>
                     <a:stretch>
                       <a:fillRect/>
                     </a:stretch>
@@ -4441,58 +4467,58 @@
         <w:ind w:firstLine="360"/>
         <w:contextualSpacing/>
       </w:pPr>
-      <w:commentRangeStart w:id="20"/>
+      <w:commentRangeStart w:id="21"/>
+      <w:r>
+        <w:rPr>
+          <w:b/>
+          <w:bCs/>
+        </w:rPr>
+        <w:t>Higher Flight Movement Density</w:t>
+      </w:r>
+      <w:r>
+        <w:t>. Scheduled flights are +16.9% higher (224,576 vs. 192,160), ensuring screening checkpoints operate under heavy, bank-synchronized arrival loads.</w:t>
+      </w:r>
+    </w:p>
+    <w:p>
+      <w:pPr>
+        <w:ind w:firstLine="360"/>
+        <w:contextualSpacing/>
+      </w:pPr>
+      <w:r>
+        <w:rPr>
+          <w:b/>
+          <w:bCs/>
+        </w:rPr>
+        <w:t>Higher Delay and Cancellation Exposure</w:t>
+      </w:r>
+      <w:r>
+        <w:t>. Average departure delay is +7.2% higher (15.23 min vs. 14.21 min), cancellation rate is +14.1% higher (1.63% vs. 1.43%), and taxi-out time is +4.5% higher (20.59 min vs. 19.69 min), reflecting genuine operational congestion.</w:t>
+      </w:r>
+    </w:p>
+    <w:p>
+      <w:pPr>
+        <w:ind w:firstLine="360"/>
+        <w:contextualSpacing/>
+      </w:pPr>
       <w:r>
         <w:rPr>
           <w:b/>
           <w:bCs/>
         </w:rPr>
         <w:lastRenderedPageBreak/>
-        <w:t>Higher Flight Movement Density</w:t>
-      </w:r>
-      <w:r>
-        <w:t>. Scheduled flights are +16.9% higher (224,576 vs. 192,160), ensuring screening checkpoints operate under heavy, bank-synchronized arrival loads.</w:t>
-      </w:r>
-    </w:p>
-    <w:p>
-      <w:pPr>
-        <w:ind w:firstLine="360"/>
-        <w:contextualSpacing/>
-      </w:pPr>
-      <w:r>
-        <w:rPr>
-          <w:b/>
-          <w:bCs/>
-        </w:rPr>
-        <w:t>Higher Delay and Cancellation Exposure</w:t>
-      </w:r>
-      <w:r>
-        <w:t>. Average departure delay is +7.2% higher (15.23 min vs. 14.21 min), cancellation rate is +14.1% higher (1.63% vs. 1.43%), and taxi-out time is +4.5% higher (20.59 min vs. 19.69 min), reflecting genuine operational congestion.</w:t>
-      </w:r>
-    </w:p>
-    <w:p>
-      <w:pPr>
-        <w:ind w:firstLine="360"/>
-        <w:contextualSpacing/>
-      </w:pPr>
-      <w:r>
-        <w:rPr>
-          <w:b/>
-          <w:bCs/>
-        </w:rPr>
         <w:t>Higher Local Originating Demand</w:t>
       </w:r>
       <w:r>
         <w:t>. Local originating passenger share is +8.1% higher (52.55% vs. 48.61%), and true local originating volume is +25.0% higher (16.38M vs. 13.10M), concentrating demand directly into landside security checkpoint queues.</w:t>
       </w:r>
-      <w:commentRangeEnd w:id="20"/>
+      <w:commentRangeEnd w:id="21"/>
       <w:r>
         <w:rPr>
           <w:rStyle w:val="CommentReference"/>
           <w:sz w:val="24"/>
           <w:szCs w:val="24"/>
         </w:rPr>
-        <w:commentReference w:id="20"/>
+        <w:commentReference w:id="21"/>
       </w:r>
     </w:p>
     <w:p>
@@ -4605,11 +4631,7 @@
         <w:t xml:space="preserve"> </w:t>
       </w:r>
       <w:r>
-        <w:t xml:space="preserve">throughput overprediction that occurs when airside connecting passengers at hubs such as DFW, DTW, and ORD are erroneously assumed to enter landside checkpoints. Third, models must enforce strict information availability by using prior-hour </w:t>
-      </w:r>
-      <w:r>
-        <w:lastRenderedPageBreak/>
-        <w:t>operational indicators (</w:t>
+        <w:t>throughput overprediction that occurs when airside connecting passengers at hubs such as DFW, DTW, and ORD are erroneously assumed to enter landside checkpoints. Third, models must enforce strict information availability by using prior-hour operational indicators (</w:t>
       </w:r>
       <m:oMath>
         <m:r>
@@ -4643,7 +4665,11 @@
         <w:t xml:space="preserve"> – </w:t>
       </w:r>
       <w:r>
-        <w:t xml:space="preserve">to accommodate positive throughput skewness and structural zeros during overnight curfew hours without generating impossible negative volume prediction. </w:t>
+        <w:t xml:space="preserve">to </w:t>
+      </w:r>
+      <w:r>
+        <w:lastRenderedPageBreak/>
+        <w:t xml:space="preserve">accommodate positive throughput skewness and structural zeros during overnight curfew hours without generating impossible negative volume prediction. </w:t>
       </w:r>
     </w:p>
     <w:p>
@@ -4721,7 +4747,7 @@
                     <pic:cNvPicPr/>
                   </pic:nvPicPr>
                   <pic:blipFill>
-                    <a:blip r:embed="rId15"/>
+                    <a:blip r:embed="rId16"/>
                     <a:stretch>
                       <a:fillRect/>
                     </a:stretch>
@@ -4806,11 +4832,7 @@
         </m:r>
       </m:oMath>
       <w:r>
-        <w:t xml:space="preserve">), corresponding directly to the 90–120 minute modal passenger show-up </w:t>
-      </w:r>
-      <w:r>
-        <w:lastRenderedPageBreak/>
-        <w:t>window established in airport terminal planning guidelines (Airport Cooperative Research Program [ACRP] Report 40; Transportation Research Board, 2010).</w:t>
+        <w:t>), corresponding directly to the 90–120 minute modal passenger show-up window established in airport terminal planning guidelines (Airport Cooperative Research Program [ACRP] Report 40; Transportation Research Board, 2010).</w:t>
       </w:r>
       <w:r>
         <w:t xml:space="preserve"> </w:t>
@@ -5425,14 +5447,7 @@
         <w:rPr>
           <w:color w:val="000000" w:themeColor="text1"/>
         </w:rPr>
-        <w:t xml:space="preserve">). Model 1 (Deterministic Flight Schedule Model) projects passenger arrival dispersion by convolving scheduled airline flight departure banks </w:t>
-      </w:r>
-      <w:r>
-        <w:rPr>
-          <w:color w:val="000000" w:themeColor="text1"/>
-        </w:rPr>
-        <w:lastRenderedPageBreak/>
-        <w:t>across empirical ACRP Report 40 show-up curves (</w:t>
+        <w:t>). Model 1 (Deterministic Flight Schedule Model) projects passenger arrival dispersion by convolving scheduled airline flight departure banks across empirical ACRP Report 40 show-up curves (</w:t>
       </w:r>
       <m:oMath>
         <m:r>
@@ -5447,7 +5462,14 @@
         <w:rPr>
           <w:color w:val="000000" w:themeColor="text1"/>
         </w:rPr>
-        <w:t>), capturing schedule geometry without requiring machine learning or live delay telemetry. Model 2 (Supervised Machine Learning Model) uses an automated decision-tree architecture trained across convolved schedule features and 24 Bureau of Transportation Statistics (BTS) On-Time Performance operational attributes (cancellations, prior-hour delays, and taxi queues). Model 3 (Dynamic Two-Stage Hybrid Model) couples scheduled flight cycles with live prior-hour recursive error correction (</w:t>
+        <w:t xml:space="preserve">), capturing schedule geometry without requiring machine learning or live delay telemetry. Model 2 (Supervised Machine Learning Model) uses an automated decision-tree architecture trained across convolved schedule features and 24 Bureau of Transportation Statistics (BTS) On-Time Performance </w:t>
+      </w:r>
+      <w:r>
+        <w:rPr>
+          <w:color w:val="000000" w:themeColor="text1"/>
+        </w:rPr>
+        <w:lastRenderedPageBreak/>
+        <w:t>operational attributes (cancellations, prior-hour delays, and taxi queues). Model 3 (Dynamic Two-Stage Hybrid Model) couples scheduled flight cycles with live prior-hour recursive error correction (</w:t>
       </w:r>
       <m:oMath>
         <m:sSub>
@@ -5573,7 +5595,7 @@
         </w:rPr>
         <w:t xml:space="preserve"> </w:t>
       </w:r>
-      <w:commentRangeStart w:id="21"/>
+      <w:commentRangeStart w:id="22"/>
       <w:r>
         <w:rPr>
           <w:color w:val="000000" w:themeColor="text1"/>
@@ -5586,7 +5608,7 @@
         </w:rPr>
         <w:t>on.</w:t>
       </w:r>
-      <w:commentRangeEnd w:id="21"/>
+      <w:commentRangeEnd w:id="22"/>
       <w:r>
         <w:rPr>
           <w:rStyle w:val="CommentReference"/>
@@ -5594,7 +5616,7 @@
           <w:sz w:val="24"/>
           <w:szCs w:val="24"/>
         </w:rPr>
-        <w:commentReference w:id="21"/>
+        <w:commentReference w:id="22"/>
       </w:r>
     </w:p>
     <w:p>
@@ -5765,7 +5787,6 @@
           <w:b/>
           <w:bCs/>
         </w:rPr>
-        <w:lastRenderedPageBreak/>
         <w:t>Dispersion Scale vs. Volume Scale</w:t>
       </w:r>
       <w:r>
@@ -5812,6 +5833,7 @@
           <w:b/>
           <w:bCs/>
         </w:rPr>
+        <w:lastRenderedPageBreak/>
         <w:t>MASE as the Primary Standard for Volatility Forecasting</w:t>
       </w:r>
       <w:r>
@@ -5940,7 +5962,7 @@
                     <pic:cNvPicPr/>
                   </pic:nvPicPr>
                   <pic:blipFill>
-                    <a:blip r:embed="rId16"/>
+                    <a:blip r:embed="rId17"/>
                     <a:stretch>
                       <a:fillRect/>
                     </a:stretch>
@@ -5965,13 +5987,13 @@
       <w:pPr>
         <w:pStyle w:val="Heading3"/>
       </w:pPr>
-      <w:bookmarkStart w:id="22" w:name="_Toc242174153"/>
-      <w:bookmarkStart w:id="23" w:name="_Toc242174805"/>
+      <w:bookmarkStart w:id="23" w:name="_Toc242174153"/>
+      <w:bookmarkStart w:id="24" w:name="_Toc242174805"/>
       <w:r>
         <w:t>General Model Performance Across the 9-Airport Cohort</w:t>
       </w:r>
-      <w:bookmarkEnd w:id="22"/>
       <w:bookmarkEnd w:id="23"/>
+      <w:bookmarkEnd w:id="24"/>
     </w:p>
     <w:p>
       <w:pPr>
@@ -5980,6 +6002,118 @@
       </w:pPr>
       <w:r>
         <w:t>The empirical results reveal clear performance separations across the modeling paradigms:</w:t>
+      </w:r>
+    </w:p>
+    <w:p>
+      <w:pPr>
+        <w:ind w:firstLine="360"/>
+        <w:contextualSpacing/>
+      </w:pPr>
+      <w:r>
+        <w:rPr>
+          <w:b/>
+          <w:bCs/>
+        </w:rPr>
+        <w:t>The Deterministic Schedule Baseline (Model 1)</w:t>
+      </w:r>
+      <w:r>
+        <w:t xml:space="preserve">. </w:t>
+      </w:r>
+      <w:r>
+        <w:t xml:space="preserve">Relying solely on published flight schedules, Model 1 achieved </w:t>
+      </w:r>
+      <m:oMath>
+        <m:r>
+          <m:rPr>
+            <m:nor/>
+          </m:rPr>
+          <m:t>Test </m:t>
+        </m:r>
+        <m:sSup>
+          <m:sSupPr>
+            <m:ctrlPr>
+              <w:rPr>
+                <w:rFonts w:ascii="Cambria Math" w:hAnsi="Cambria Math"/>
+              </w:rPr>
+            </m:ctrlPr>
+          </m:sSupPr>
+          <m:e>
+            <m:r>
+              <w:rPr>
+                <w:rFonts w:ascii="Cambria Math" w:hAnsi="Cambria Math"/>
+              </w:rPr>
+              <m:t>R</m:t>
+            </m:r>
+          </m:e>
+          <m:sup>
+            <m:r>
+              <w:rPr>
+                <w:rFonts w:ascii="Cambria Math" w:hAnsi="Cambria Math"/>
+              </w:rPr>
+              <m:t>2</m:t>
+            </m:r>
+          </m:sup>
+        </m:sSup>
+        <m:r>
+          <w:rPr>
+            <w:rFonts w:ascii="Cambria Math" w:hAnsi="Cambria Math"/>
+          </w:rPr>
+          <m:t>=0.4980</m:t>
+        </m:r>
+      </m:oMath>
+      <w:r>
+        <w:t>(</w:t>
+      </w:r>
+      <m:oMath>
+        <m:r>
+          <m:rPr>
+            <m:nor/>
+          </m:rPr>
+          <m:t>RMSE</m:t>
+        </m:r>
+        <m:r>
+          <w:rPr>
+            <w:rFonts w:ascii="Cambria Math" w:hAnsi="Cambria Math"/>
+          </w:rPr>
+          <m:t>=313.4</m:t>
+        </m:r>
+      </m:oMath>
+      <w:r>
+        <w:t xml:space="preserve"> pax/hr, </w:t>
+      </w:r>
+      <m:oMath>
+        <m:r>
+          <m:rPr>
+            <m:nor/>
+          </m:rPr>
+          <m:t>MASE</m:t>
+        </m:r>
+        <m:r>
+          <w:rPr>
+            <w:rFonts w:ascii="Cambria Math" w:hAnsi="Cambria Math"/>
+          </w:rPr>
+          <m:t>=0.945</m:t>
+        </m:r>
+      </m:oMath>
+      <w:r>
+        <w:t>). This outperforms daily persistence by 5.5% (</w:t>
+      </w:r>
+      <m:oMath>
+        <m:r>
+          <m:rPr>
+            <m:nor/>
+          </m:rPr>
+          <m:t>MASE</m:t>
+        </m:r>
+        <m:r>
+          <w:rPr>
+            <w:rFonts w:ascii="Cambria Math" w:hAnsi="Cambria Math"/>
+          </w:rPr>
+          <m:t>&lt;1.000</m:t>
+        </m:r>
+      </m:oMath>
+      <w:r>
+        <w:t>), demonstrating that schedule geometry alone captures approximately half of total checkpoint arrival variance without requiring machine learning infrastructure</w:t>
       </w:r>
     </w:p>
     <w:p>
@@ -5993,118 +6127,6 @@
           <w:bCs/>
         </w:rPr>
         <w:lastRenderedPageBreak/>
-        <w:t>The Deterministic Schedule Baseline (Model 1)</w:t>
-      </w:r>
-      <w:r>
-        <w:t xml:space="preserve">. </w:t>
-      </w:r>
-      <w:r>
-        <w:t xml:space="preserve">Relying solely on published flight schedules, Model 1 achieved </w:t>
-      </w:r>
-      <m:oMath>
-        <m:r>
-          <m:rPr>
-            <m:nor/>
-          </m:rPr>
-          <m:t>Test </m:t>
-        </m:r>
-        <m:sSup>
-          <m:sSupPr>
-            <m:ctrlPr>
-              <w:rPr>
-                <w:rFonts w:ascii="Cambria Math" w:hAnsi="Cambria Math"/>
-              </w:rPr>
-            </m:ctrlPr>
-          </m:sSupPr>
-          <m:e>
-            <m:r>
-              <w:rPr>
-                <w:rFonts w:ascii="Cambria Math" w:hAnsi="Cambria Math"/>
-              </w:rPr>
-              <m:t>R</m:t>
-            </m:r>
-          </m:e>
-          <m:sup>
-            <m:r>
-              <w:rPr>
-                <w:rFonts w:ascii="Cambria Math" w:hAnsi="Cambria Math"/>
-              </w:rPr>
-              <m:t>2</m:t>
-            </m:r>
-          </m:sup>
-        </m:sSup>
-        <m:r>
-          <w:rPr>
-            <w:rFonts w:ascii="Cambria Math" w:hAnsi="Cambria Math"/>
-          </w:rPr>
-          <m:t>=0.4980</m:t>
-        </m:r>
-      </m:oMath>
-      <w:r>
-        <w:t>(</w:t>
-      </w:r>
-      <m:oMath>
-        <m:r>
-          <m:rPr>
-            <m:nor/>
-          </m:rPr>
-          <m:t>RMSE</m:t>
-        </m:r>
-        <m:r>
-          <w:rPr>
-            <w:rFonts w:ascii="Cambria Math" w:hAnsi="Cambria Math"/>
-          </w:rPr>
-          <m:t>=313.4</m:t>
-        </m:r>
-      </m:oMath>
-      <w:r>
-        <w:t xml:space="preserve"> pax/hr, </w:t>
-      </w:r>
-      <m:oMath>
-        <m:r>
-          <m:rPr>
-            <m:nor/>
-          </m:rPr>
-          <m:t>MASE</m:t>
-        </m:r>
-        <m:r>
-          <w:rPr>
-            <w:rFonts w:ascii="Cambria Math" w:hAnsi="Cambria Math"/>
-          </w:rPr>
-          <m:t>=0.945</m:t>
-        </m:r>
-      </m:oMath>
-      <w:r>
-        <w:t>). This outperforms daily persistence by 5.5% (</w:t>
-      </w:r>
-      <m:oMath>
-        <m:r>
-          <m:rPr>
-            <m:nor/>
-          </m:rPr>
-          <m:t>MASE</m:t>
-        </m:r>
-        <m:r>
-          <w:rPr>
-            <w:rFonts w:ascii="Cambria Math" w:hAnsi="Cambria Math"/>
-          </w:rPr>
-          <m:t>&lt;1.000</m:t>
-        </m:r>
-      </m:oMath>
-      <w:r>
-        <w:t>), demonstrating that schedule geometry alone captures approximately half of total checkpoint arrival variance without requiring machine learning infrastructure</w:t>
-      </w:r>
-    </w:p>
-    <w:p>
-      <w:pPr>
-        <w:ind w:firstLine="360"/>
-        <w:contextualSpacing/>
-      </w:pPr>
-      <w:r>
-        <w:rPr>
-          <w:b/>
-          <w:bCs/>
-        </w:rPr>
         <w:t>Supervised Machine Learning (</w:t>
       </w:r>
       <w:r>
@@ -6558,14 +6580,13 @@
       <w:pPr>
         <w:pStyle w:val="Heading3"/>
       </w:pPr>
-      <w:bookmarkStart w:id="24" w:name="_Toc242174154"/>
-      <w:bookmarkStart w:id="25" w:name="_Toc242174806"/>
-      <w:r>
-        <w:lastRenderedPageBreak/>
+      <w:bookmarkStart w:id="25" w:name="_Toc242174154"/>
+      <w:bookmarkStart w:id="26" w:name="_Toc242174806"/>
+      <w:r>
         <w:t>Empirical Confirmation of Asymmetric Trade-Offs</w:t>
       </w:r>
-      <w:bookmarkEnd w:id="24"/>
       <w:bookmarkEnd w:id="25"/>
+      <w:bookmarkEnd w:id="26"/>
     </w:p>
     <w:p>
       <w:pPr>
@@ -6603,7 +6624,11 @@
         <w:t xml:space="preserve"> under routine operations. </w:t>
       </w:r>
       <w:r>
-        <w:t>However, Model 2 achieves this with near-zero computational overhead and requires no real-time checkpoint data feeds, allowing airport managers to generate staffing schedules days in advance rather than waiting on live hourly sensor updates</w:t>
+        <w:t xml:space="preserve">However, Model 2 achieves this with near-zero computational </w:t>
+      </w:r>
+      <w:r>
+        <w:lastRenderedPageBreak/>
+        <w:t>overhead and requires no real-time checkpoint data feeds, allowing airport managers to generate staffing schedules days in advance rather than waiting on live hourly sensor updates</w:t>
       </w:r>
       <w:r>
         <w:t>.</w:t>
@@ -6893,11 +6918,7 @@
         <w:t xml:space="preserve"> out-of-time holdout evaluations confirm the thesis hypothesis: no single predictive modeling paradigm is universally superior across all operational regimes. Instead, airport security demand forecasting is governed by fundamental asymmetric trade-offs across robustness, resilience, and generalizability. </w:t>
       </w:r>
       <w:r>
-        <w:t xml:space="preserve">The Dynamic Hybrid model (Model 3) is best during severe flight delays and irregular operations, the Deterministic Schedule model (Model 1) transfers most reliably to new airports without retraining, and the Supervised Machine Learning </w:t>
-      </w:r>
-      <w:r>
-        <w:lastRenderedPageBreak/>
-        <w:t>model (Model 2) is the most practical choice for routine advance staffing. Airport operators and TSA leadership should therefore select their forecasting tool based on daily operating conditions rather than relying on a single method.</w:t>
+        <w:t>The Dynamic Hybrid model (Model 3) is best during severe flight delays and irregular operations, the Deterministic Schedule model (Model 1) transfers most reliably to new airports without retraining, and the Supervised Machine Learning model (Model 2) is the most practical choice for routine advance staffing. Airport operators and TSA leadership should therefore select their forecasting tool based on daily operating conditions rather than relying on a single method.</w:t>
       </w:r>
     </w:p>
     <w:sectPr>
@@ -6912,7 +6933,7 @@
 
 <file path=word/comments.xml><?xml version="1.0" encoding="utf-8"?>
 <w:comments xmlns:wpc="http://schemas.microsoft.com/office/word/2010/wordprocessingCanvas" xmlns:cx="http://schemas.microsoft.com/office/drawing/2014/chartex" xmlns:cx1="http://schemas.microsoft.com/office/drawing/2015/9/8/chartex" xmlns:cx2="http://schemas.microsoft.com/office/drawing/2015/10/21/chartex" xmlns:cx3="http://schemas.microsoft.com/office/drawing/2016/5/9/chartex" xmlns:cx4="http://schemas.microsoft.com/office/drawing/2016/5/10/chartex" xmlns:cx5="http://schemas.microsoft.com/office/drawing/2016/5/11/chartex" xmlns:cx6="http://schemas.microsoft.com/office/drawing/2016/5/12/chartex" xmlns:cx7="http://schemas.microsoft.com/office/drawing/2016/5/13/chartex" xmlns:cx8="http://schemas.microsoft.com/office/drawing/2016/5/14/chartex" xmlns:mc="http://schemas.openxmlformats.org/markup-compatibility/2006" xmlns:m="http://schemas.openxmlformats.org/officeDocument/2006/math" xmlns:aink="http://schemas.microsoft.com/office/drawing/2016/ink" xmlns:am3d="http://schemas.microsoft.com/office/drawing/2017/model3d" xmlns:oel="http://schemas.microsoft.com/office/2019/extlst" xmlns:r="http://schemas.openxmlformats.org/officeDocument/2006/relationships" xmlns:wp14="http://schemas.microsoft.com/office/word/2010/wordprocessingDrawing" xmlns:wp="http://schemas.openxmlformats.org/drawingml/2006/wordprocessingDrawing" xmlns:wpg="http://schemas.microsoft.com/office/word/2010/wordprocessingGroup" xmlns:wpi="http://schemas.microsoft.com/office/word/2010/wordprocessingInk" xmlns:wps="http://schemas.microsoft.com/office/word/2010/wordprocessingShape" xmlns:o="urn:schemas-microsoft-com:office:office" xmlns:v="urn:schemas-microsoft-com:vml" xmlns:w10="urn:schemas-microsoft-com:office:word" xmlns:w="http://schemas.openxmlformats.org/wordprocessingml/2006/main" xmlns:w14="http://schemas.microsoft.com/office/word/2010/wordml" xmlns:w15="http://schemas.microsoft.com/office/word/2012/wordml" xmlns:w16cex="http://schemas.microsoft.com/office/word/2018/wordml/cex" xmlns:w16cid="http://schemas.microsoft.com/office/word/2016/wordml/cid" xmlns:w16="http://schemas.microsoft.com/office/word/2018/wordml" xmlns:w16sdtdh="http://schemas.microsoft.com/office/word/2020/wordml/sdtdatahash" xmlns:w16sdtfl="http://schemas.microsoft.com/office/word/2024/wordml/sdtformatlock" xmlns:w16se="http://schemas.microsoft.com/office/word/2015/wordml/symex" xmlns:w16du="http://schemas.microsoft.com/office/word/2023/wordml/word16du" xmlns:wne="http://schemas.microsoft.com/office/word/2006/wordml" mc:Ignorable="w14 w15 w16se w16cid w16 w16cex w16sdtdh w16sdtfl w16du wp14">
-  <w:comment w:id="6" w:author="Gleich, Leila" w:date="2026-10-06T16:07:00Z" w:initials="GL">
+  <w:comment w:id="6" w:author="Gleich, Leila" w:date="2026-10-06T16:57:00Z" w:initials="GL">
     <w:p>
       <w:r>
         <w:rPr>
@@ -6929,7 +6950,24 @@
       </w:r>
     </w:p>
   </w:comment>
-  <w:comment w:id="15" w:author="Gleich, Leila" w:date="2026-10-06T16:35:00Z" w:initials="GL">
+  <w:comment w:id="11" w:author="Gleich, Leila" w:date="2026-10-06T17:08:00Z" w:initials="GL">
+    <w:p>
+      <w:r>
+        <w:rPr>
+          <w:rStyle w:val="CommentReference"/>
+        </w:rPr>
+        <w:annotationRef/>
+      </w:r>
+      <w:r>
+        <w:rPr>
+          <w:sz w:val="20"/>
+          <w:szCs w:val="20"/>
+        </w:rPr>
+        <w:t>Table</w:t>
+      </w:r>
+    </w:p>
+  </w:comment>
+  <w:comment w:id="16" w:author="Gleich, Leila" w:date="2026-10-06T16:35:00Z" w:initials="GL">
     <w:p>
       <w:r>
         <w:rPr>
@@ -6946,7 +6984,7 @@
       </w:r>
     </w:p>
   </w:comment>
-  <w:comment w:id="20" w:author="Gleich, Leila" w:date="2026-10-06T16:11:00Z" w:initials="GL">
+  <w:comment w:id="21" w:author="Gleich, Leila" w:date="2026-10-06T16:11:00Z" w:initials="GL">
     <w:p>
       <w:r>
         <w:rPr>
@@ -6963,7 +7001,7 @@
       </w:r>
     </w:p>
   </w:comment>
-  <w:comment w:id="21" w:author="Gleich, Leila" w:date="2026-10-06T16:32:00Z" w:initials="GL">
+  <w:comment w:id="22" w:author="Gleich, Leila" w:date="2026-10-06T16:32:00Z" w:initials="GL">
     <w:p>
       <w:r>
         <w:rPr>
@@ -6985,7 +7023,8 @@
 
 <file path=word/commentsExtended.xml><?xml version="1.0" encoding="utf-8"?>
 <w15:commentsEx xmlns:wpc="http://schemas.microsoft.com/office/word/2010/wordprocessingCanvas" xmlns:cx="http://schemas.microsoft.com/office/drawing/2014/chartex" xmlns:cx1="http://schemas.microsoft.com/office/drawing/2015/9/8/chartex" xmlns:cx2="http://schemas.microsoft.com/office/drawing/2015/10/21/chartex" xmlns:cx3="http://schemas.microsoft.com/office/drawing/2016/5/9/chartex" xmlns:cx4="http://schemas.microsoft.com/office/drawing/2016/5/10/chartex" xmlns:cx5="http://schemas.microsoft.com/office/drawing/2016/5/11/chartex" xmlns:cx6="http://schemas.microsoft.com/office/drawing/2016/5/12/chartex" xmlns:cx7="http://schemas.microsoft.com/office/drawing/2016/5/13/chartex" xmlns:cx8="http://schemas.microsoft.com/office/drawing/2016/5/14/chartex" xmlns:mc="http://schemas.openxmlformats.org/markup-compatibility/2006" xmlns:m="http://schemas.openxmlformats.org/officeDocument/2006/math" xmlns:aink="http://schemas.microsoft.com/office/drawing/2016/ink" xmlns:am3d="http://schemas.microsoft.com/office/drawing/2017/model3d" xmlns:oel="http://schemas.microsoft.com/office/2019/extlst" xmlns:r="http://schemas.openxmlformats.org/officeDocument/2006/relationships" xmlns:wp14="http://schemas.microsoft.com/office/word/2010/wordprocessingDrawing" xmlns:wp="http://schemas.openxmlformats.org/drawingml/2006/wordprocessingDrawing" xmlns:wpg="http://schemas.microsoft.com/office/word/2010/wordprocessingGroup" xmlns:wpi="http://schemas.microsoft.com/office/word/2010/wordprocessingInk" xmlns:wps="http://schemas.microsoft.com/office/word/2010/wordprocessingShape" xmlns:o="urn:schemas-microsoft-com:office:office" xmlns:v="urn:schemas-microsoft-com:vml" xmlns:w10="urn:schemas-microsoft-com:office:word" xmlns:w="http://schemas.openxmlformats.org/wordprocessingml/2006/main" xmlns:w14="http://schemas.microsoft.com/office/word/2010/wordml" xmlns:w15="http://schemas.microsoft.com/office/word/2012/wordml" xmlns:w16cex="http://schemas.microsoft.com/office/word/2018/wordml/cex" xmlns:w16cid="http://schemas.microsoft.com/office/word/2016/wordml/cid" xmlns:w16="http://schemas.microsoft.com/office/word/2018/wordml" xmlns:w16sdtdh="http://schemas.microsoft.com/office/word/2020/wordml/sdtdatahash" xmlns:w16sdtfl="http://schemas.microsoft.com/office/word/2024/wordml/sdtformatlock" xmlns:w16se="http://schemas.microsoft.com/office/word/2015/wordml/symex" xmlns:w16du="http://schemas.microsoft.com/office/word/2023/wordml/word16du" xmlns:wne="http://schemas.microsoft.com/office/word/2006/wordml" mc:Ignorable="w14 w15 w16se w16cid w16 w16cex w16sdtdh w16sdtfl w16du wp14">
-  <w15:commentEx w15:paraId="5349BD15" w15:done="0"/>
+  <w15:commentEx w15:paraId="0CFFE471" w15:done="0"/>
+  <w15:commentEx w15:paraId="54CB7DD2" w15:done="0"/>
   <w15:commentEx w15:paraId="0DBBC9AF" w15:done="0"/>
   <w15:commentEx w15:paraId="459D9DC1" w15:done="0"/>
   <w15:commentEx w15:paraId="763D4259" w15:done="0"/>
@@ -6994,7 +7033,8 @@
 
 <file path=word/commentsExtensible.xml><?xml version="1.0" encoding="utf-8"?>
 <w16cex:commentsExtensible xmlns:wpc="http://schemas.microsoft.com/office/word/2010/wordprocessingCanvas" xmlns:cx="http://schemas.microsoft.com/office/drawing/2014/chartex" xmlns:cx1="http://schemas.microsoft.com/office/drawing/2015/9/8/chartex" xmlns:cx2="http://schemas.microsoft.com/office/drawing/2015/10/21/chartex" xmlns:cx3="http://schemas.microsoft.com/office/drawing/2016/5/9/chartex" xmlns:cx4="http://schemas.microsoft.com/office/drawing/2016/5/10/chartex" xmlns:cx5="http://schemas.microsoft.com/office/drawing/2016/5/11/chartex" xmlns:cx6="http://schemas.microsoft.com/office/drawing/2016/5/12/chartex" xmlns:cx7="http://schemas.microsoft.com/office/drawing/2016/5/13/chartex" xmlns:cx8="http://schemas.microsoft.com/office/drawing/2016/5/14/chartex" xmlns:cr="http://schemas.microsoft.com/office/comments/2020/reactions" xmlns:mc="http://schemas.openxmlformats.org/markup-compatibility/2006" xmlns:m="http://schemas.openxmlformats.org/officeDocument/2006/math" xmlns:aink="http://schemas.microsoft.com/office/drawing/2016/ink" xmlns:am3d="http://schemas.microsoft.com/office/drawing/2017/model3d" xmlns:oel="http://schemas.microsoft.com/office/2019/extlst" xmlns:r="http://schemas.openxmlformats.org/officeDocument/2006/relationships" xmlns:wp14="http://schemas.microsoft.com/office/word/2010/wordprocessingDrawing" xmlns:wp="http://schemas.openxmlformats.org/drawingml/2006/wordprocessingDrawing" xmlns:wpg="http://schemas.microsoft.com/office/word/2010/wordprocessingGroup" xmlns:wpi="http://schemas.microsoft.com/office/word/2010/wordprocessingInk" xmlns:wps="http://schemas.microsoft.com/office/word/2010/wordprocessingShape" xmlns:o="urn:schemas-microsoft-com:office:office" xmlns:v="urn:schemas-microsoft-com:vml" xmlns:w10="urn:schemas-microsoft-com:office:word" xmlns:w="http://schemas.openxmlformats.org/wordprocessingml/2006/main" xmlns:w14="http://schemas.microsoft.com/office/word/2010/wordml" xmlns:w15="http://schemas.microsoft.com/office/word/2012/wordml" xmlns:w16cex="http://schemas.microsoft.com/office/word/2018/wordml/cex" xmlns:w16cid="http://schemas.microsoft.com/office/word/2016/wordml/cid" xmlns:w16="http://schemas.microsoft.com/office/word/2018/wordml" xmlns:w16sdtdh="http://schemas.microsoft.com/office/word/2020/wordml/sdtdatahash" xmlns:w16sdtfl="http://schemas.microsoft.com/office/word/2024/wordml/sdtformatlock" xmlns:w16se="http://schemas.microsoft.com/office/word/2015/wordml/symex" xmlns:w16du="http://schemas.microsoft.com/office/word/2023/wordml/word16du" xmlns:wne="http://schemas.microsoft.com/office/word/2006/wordml" mc:Ignorable="w14 w15 w16se w16cid w16 w16cex w16sdtdh w16sdtfl cr w16du wp14">
-  <w16cex:commentExtensible w16cex:durableId="1F6C3762" w16cex:dateUtc="2026-10-06T23:07:00Z"/>
+  <w16cex:commentExtensible w16cex:durableId="6F5AD68B" w16cex:dateUtc="2026-10-06T23:57:00Z"/>
+  <w16cex:commentExtensible w16cex:durableId="4CB04047" w16cex:dateUtc="2026-10-07T00:08:00Z"/>
   <w16cex:commentExtensible w16cex:durableId="3786DA32" w16cex:dateUtc="2026-10-06T23:35:00Z"/>
   <w16cex:commentExtensible w16cex:durableId="755375B4" w16cex:dateUtc="2026-10-06T23:11:00Z"/>
   <w16cex:commentExtensible w16cex:durableId="19A75B7F" w16cex:dateUtc="2026-10-06T23:32:00Z"/>
@@ -7003,7 +7043,8 @@
 
 <file path=word/commentsIds.xml><?xml version="1.0" encoding="utf-8"?>
 <w16cid:commentsIds xmlns:wpc="http://schemas.microsoft.com/office/word/2010/wordprocessingCanvas" xmlns:cx="http://schemas.microsoft.com/office/drawing/2014/chartex" xmlns:cx1="http://schemas.microsoft.com/office/drawing/2015/9/8/chartex" xmlns:cx2="http://schemas.microsoft.com/office/drawing/2015/10/21/chartex" xmlns:cx3="http://schemas.microsoft.com/office/drawing/2016/5/9/chartex" xmlns:cx4="http://schemas.microsoft.com/office/drawing/2016/5/10/chartex" xmlns:cx5="http://schemas.microsoft.com/office/drawing/2016/5/11/chartex" xmlns:cx6="http://schemas.microsoft.com/office/drawing/2016/5/12/chartex" xmlns:cx7="http://schemas.microsoft.com/office/drawing/2016/5/13/chartex" xmlns:cx8="http://schemas.microsoft.com/office/drawing/2016/5/14/chartex" xmlns:mc="http://schemas.openxmlformats.org/markup-compatibility/2006" xmlns:m="http://schemas.openxmlformats.org/officeDocument/2006/math" xmlns:aink="http://schemas.microsoft.com/office/drawing/2016/ink" xmlns:am3d="http://schemas.microsoft.com/office/drawing/2017/model3d" xmlns:oel="http://schemas.microsoft.com/office/2019/extlst" xmlns:r="http://schemas.openxmlformats.org/officeDocument/2006/relationships" xmlns:wp14="http://schemas.microsoft.com/office/word/2010/wordprocessingDrawing" xmlns:wp="http://schemas.openxmlformats.org/drawingml/2006/wordprocessingDrawing" xmlns:wpg="http://schemas.microsoft.com/office/word/2010/wordprocessingGroup" xmlns:wpi="http://schemas.microsoft.com/office/word/2010/wordprocessingInk" xmlns:wps="http://schemas.microsoft.com/office/word/2010/wordprocessingShape" xmlns:o="urn:schemas-microsoft-com:office:office" xmlns:v="urn:schemas-microsoft-com:vml" xmlns:w10="urn:schemas-microsoft-com:office:word" xmlns:w="http://schemas.openxmlformats.org/wordprocessingml/2006/main" xmlns:w14="http://schemas.microsoft.com/office/word/2010/wordml" xmlns:w15="http://schemas.microsoft.com/office/word/2012/wordml" xmlns:w16cex="http://schemas.microsoft.com/office/word/2018/wordml/cex" xmlns:w16cid="http://schemas.microsoft.com/office/word/2016/wordml/cid" xmlns:w16="http://schemas.microsoft.com/office/word/2018/wordml" xmlns:w16sdtdh="http://schemas.microsoft.com/office/word/2020/wordml/sdtdatahash" xmlns:w16sdtfl="http://schemas.microsoft.com/office/word/2024/wordml/sdtformatlock" xmlns:w16se="http://schemas.microsoft.com/office/word/2015/wordml/symex" xmlns:w16du="http://schemas.microsoft.com/office/word/2023/wordml/word16du" xmlns:wne="http://schemas.microsoft.com/office/word/2006/wordml" mc:Ignorable="w14 w15 w16se w16cid w16 w16cex w16sdtdh w16sdtfl w16du wp14">
-  <w16cid:commentId w16cid:paraId="5349BD15" w16cid:durableId="1F6C3762"/>
+  <w16cid:commentId w16cid:paraId="0CFFE471" w16cid:durableId="6F5AD68B"/>
+  <w16cid:commentId w16cid:paraId="54CB7DD2" w16cid:durableId="4CB04047"/>
   <w16cid:commentId w16cid:paraId="0DBBC9AF" w16cid:durableId="3786DA32"/>
   <w16cid:commentId w16cid:paraId="459D9DC1" w16cid:durableId="755375B4"/>
   <w16cid:commentId w16cid:paraId="763D4259" w16cid:durableId="19A75B7F"/>
@@ -10403,4 +10444,16 @@
     </a:ext>
   </a:extLst>
 </a:theme>
+</file>
+
+<file path=customXml/item1.xml><?xml version="1.0" encoding="utf-8"?>
+<b:Sources xmlns:b="http://schemas.openxmlformats.org/officeDocument/2006/bibliography" xmlns="http://schemas.openxmlformats.org/officeDocument/2006/bibliography" SelectedStyle="/APASixthEditionOfficeOnline.xsl" StyleName="APA" Version="6"/>
+</file>
+
+<file path=customXml/itemProps1.xml><?xml version="1.0" encoding="utf-8"?>
+<ds:datastoreItem xmlns:ds="http://schemas.openxmlformats.org/officeDocument/2006/customXml" ds:itemID="{5F4C687B-E04C-C349-AABD-CC81BDD09DCD}">
+  <ds:schemaRefs>
+    <ds:schemaRef ds:uri="http://schemas.openxmlformats.org/officeDocument/2006/bibliography"/>
+  </ds:schemaRefs>
+</ds:datastoreItem>
 </file>
</xml_diff>